<commit_message>
docs: update hackathon submission — LLM speaker ID, hallucination filter, multi-path audio, PII label, Langfuse v3
</commit_message>
<xml_diff>
--- a/hackathon_submission.docx
+++ b/hackathon_submission.docx
@@ -1177,6 +1177,25 @@
               <w:t xml:space="preserve">No RAG, no agents, no fine-tuning — deliberate choice to keep latency deterministic</w:t>
             </w:r>
           </w:p>
+          <w:p>
+            <w:pPr>
+              <w:pStyle w:val="ListParagraph"/>
+              <w:numPr>
+                <w:ilvl w:val="0"/>
+                <w:numId w:val="2"/>
+              </w:numPr>
+              <w:spacing w:before="40"/>
+            </w:pPr>
+            <w:r>
+              <w:rPr>
+                <w:rFonts w:ascii="Arial" w:cs="Arial" w:eastAsia="Arial" w:hAnsi="Arial"/>
+                <w:color w:val="1A1A1A"/>
+                <w:sz w:val="20"/>
+                <w:szCs w:val="20"/>
+              </w:rPr>
+              <w:t xml:space="preserve">LLM-based speaker identification: rep/customer role inferred from content inside the same judge forward pass — no extra model, no extra latency. In production the telephony/CTI layer provides this directly from channel metadata.</w:t>
+            </w:r>
+          </w:p>
         </w:tc>
       </w:tr>
       <w:tr>
@@ -1638,6 +1657,101 @@
                 <w:szCs w:val="20"/>
               </w:rPr>
               <w:t xml:space="preserve">run_vllm_server.sh — one-command startup: deps, GUI, vLLM, Langfuse config</w:t>
+            </w:r>
+          </w:p>
+          <w:p>
+            <w:pPr>
+              <w:pStyle w:val="ListParagraph"/>
+              <w:numPr>
+                <w:ilvl w:val="0"/>
+                <w:numId w:val="2"/>
+              </w:numPr>
+              <w:spacing w:before="40"/>
+            </w:pPr>
+            <w:r>
+              <w:rPr>
+                <w:rFonts w:ascii="Arial" w:cs="Arial" w:eastAsia="Arial" w:hAnsi="Arial"/>
+                <w:color w:val="1A1A1A"/>
+                <w:sz w:val="20"/>
+                <w:szCs w:val="20"/>
+              </w:rPr>
+              <w:t xml:space="preserve">LLM speaker identification: judge labels every turn rep/customer from conversational content — works on mono and stereo recordings. In live deployments CTI metadata replaces inference entirely.</w:t>
+            </w:r>
+          </w:p>
+          <w:p>
+            <w:pPr>
+              <w:pStyle w:val="ListParagraph"/>
+              <w:numPr>
+                <w:ilvl w:val="0"/>
+                <w:numId w:val="2"/>
+              </w:numPr>
+              <w:spacing w:before="40"/>
+            </w:pPr>
+            <w:r>
+              <w:rPr>
+                <w:rFonts w:ascii="Arial" w:cs="Arial" w:eastAsia="Arial" w:hAnsi="Arial"/>
+                <w:color w:val="1A1A1A"/>
+                <w:sz w:val="20"/>
+                <w:szCs w:val="20"/>
+              </w:rPr>
+              <w:t xml:space="preserve">Hallucination loop filter: word-density check (unique words &lt; 15%) drops Whisper/Vosk decoder loops (e.g. “BIRDS CHIRPING” x60, ¶¶ symbols) before they reach the LLM judge or the UI.</w:t>
+            </w:r>
+          </w:p>
+          <w:p>
+            <w:pPr>
+              <w:pStyle w:val="ListParagraph"/>
+              <w:numPr>
+                <w:ilvl w:val="0"/>
+                <w:numId w:val="2"/>
+              </w:numPr>
+              <w:spacing w:before="40"/>
+            </w:pPr>
+            <w:r>
+              <w:rPr>
+                <w:rFonts w:ascii="Arial" w:cs="Arial" w:eastAsia="Arial" w:hAnsi="Arial"/>
+                <w:color w:val="1A1A1A"/>
+                <w:sz w:val="20"/>
+                <w:szCs w:val="20"/>
+              </w:rPr>
+              <w:t xml:space="preserve">Multi-path audio discovery: AUDIO_DIRS list scans multiple recording folders; SELECTED_CALL_IDS variable lets you pin specific recordings or run all — no code changes required.</w:t>
+            </w:r>
+          </w:p>
+          <w:p>
+            <w:pPr>
+              <w:pStyle w:val="ListParagraph"/>
+              <w:numPr>
+                <w:ilvl w:val="0"/>
+                <w:numId w:val="2"/>
+              </w:numPr>
+              <w:spacing w:before="40"/>
+            </w:pPr>
+            <w:r>
+              <w:rPr>
+                <w:rFonts w:ascii="Arial" w:cs="Arial" w:eastAsia="Arial" w:hAnsi="Arial"/>
+                <w:color w:val="1A1A1A"/>
+                <w:sz w:val="20"/>
+                <w:szCs w:val="20"/>
+              </w:rPr>
+              <w:t xml:space="preserve">PII/Sensitive beep label: censor-tone chunks shown as 🔇 PII/Sensitive in the skipped-segment panel and cell log, distinguishing them from silence drops.</w:t>
+            </w:r>
+          </w:p>
+          <w:p>
+            <w:pPr>
+              <w:pStyle w:val="ListParagraph"/>
+              <w:numPr>
+                <w:ilvl w:val="0"/>
+                <w:numId w:val="2"/>
+              </w:numPr>
+              <w:spacing w:before="40"/>
+            </w:pPr>
+            <w:r>
+              <w:rPr>
+                <w:rFonts w:ascii="Arial" w:cs="Arial" w:eastAsia="Arial" w:hAnsi="Arial"/>
+                <w:color w:val="1A1A1A"/>
+                <w:sz w:val="20"/>
+                <w:szCs w:val="20"/>
+              </w:rPr>
+              <w:t xml:space="preserve">Langfuse SDK v3 rewrite: LLM call inside context manager for accurate latency; per-call trace cache powers the in-dashboard info panel; cloud/self-hosted/local-file modes.</w:t>
             </w:r>
           </w:p>
         </w:tc>
@@ -2535,6 +2649,25 @@
                 <w:szCs w:val="20"/>
               </w:rPr>
               <w:t xml:space="preserve">Graceful degradation: GPU unavailable → CPU ASR fallback; Langfuse down → silent no-op; GUI restarted mid-run → auto-reconnects within 10s without stopping the pipeline</w:t>
+            </w:r>
+          </w:p>
+          <w:p>
+            <w:pPr>
+              <w:pStyle w:val="ListParagraph"/>
+              <w:numPr>
+                <w:ilvl w:val="0"/>
+                <w:numId w:val="2"/>
+              </w:numPr>
+              <w:spacing w:before="40"/>
+            </w:pPr>
+            <w:r>
+              <w:rPr>
+                <w:rFonts w:ascii="Arial" w:cs="Arial" w:eastAsia="Arial" w:hAnsi="Arial"/>
+                <w:color w:val="1A1A1A"/>
+                <w:sz w:val="20"/>
+                <w:szCs w:val="20"/>
+              </w:rPr>
+              <w:t xml:space="preserve">Hallucination-resistant ASR gate: word-density filter drops repetition loops at the transcription boundary — junk never enters the LLM judge, so violation counts stay accurate even on noisy recordings with hold music or background sound.</w:t>
             </w:r>
           </w:p>
         </w:tc>

</xml_diff>

<commit_message>
docs: update docx — 3-tier speaker ID replaces LLM-only description
</commit_message>
<xml_diff>
--- a/hackathon_submission.docx
+++ b/hackathon_submission.docx
@@ -1193,7 +1193,7 @@
                 <w:sz w:val="20"/>
                 <w:szCs w:val="20"/>
               </w:rPr>
-              <w:t xml:space="preserve">LLM-based speaker identification: rep/customer role inferred from content inside the same judge forward pass — no extra model, no extra latency. In production the telephony/CTI layer provides this directly from channel metadata.</w:t>
+              <w:t>3-tier speaker identification: stereo channel metadata (ground truth, zero inference) → keyword regex pre-pass (microseconds, zero tokens — catches clear cases like "your agent", "loyal member", "how can I help", "let me pull up") → LLM content analysis fallback (only for genuinely ambiguous chunks where both speakers are audible). In live deployments the telephony/CTI layer provides channel metadata directly, bypassing all inference.</w:t>
             </w:r>
           </w:p>
         </w:tc>
@@ -1675,7 +1675,7 @@
                 <w:sz w:val="20"/>
                 <w:szCs w:val="20"/>
               </w:rPr>
-              <w:t xml:space="preserve">LLM speaker identification: judge labels every turn rep/customer from conversational content — works on mono and stereo recordings. In live deployments CTI metadata replaces inference entirely.</w:t>
+              <w:t>3-tier speaker identification: stereo channel metadata → keyword regex pre-pass → LLM fallback. Regex catches clear customer/rep markers ("loyal member", "your agent", "she threatened", "how can I help", "let me pull up") at zero token cost; LLM only consulted for ambiguous chunks. Works on mono and stereo.</w:t>
             </w:r>
           </w:p>
           <w:p>

</xml_diff>

<commit_message>
docs+comments: align with current code — 3-tier speaker ID, max_tokens=28, large-v3-turbo
Notebook cell 17 (BRAIN):
- Rewrote speaker ID header: 3-tier (stereo metadata → regex → LLM fallback)
- Fixed PERF OVERHAUL 3 inline comment: max_tokens 64→28 (was wrong 48), reason 35 chars (was wrong 60)
- Fixed stale 'REP_MARKER_PHRASES removed' comment: now says 'replaced by _REP_RE/_CUSTOMER_RE'

Notebook cell 15 (EARS):
- Fixed 'large-v3' → 'large-v3-turbo' in FILE/LIVE MODE header lines

hackathon_submission.docx:
- Stage 2 description: adds micro-utterance ack fast-path, 3-tier speaker ID, max_tokens=28
- 'What was built' hallucination bullet: updated to multi-check quality_gated() description
</commit_message>
<xml_diff>
--- a/hackathon_submission.docx
+++ b/hackathon_submission.docx
@@ -999,7 +999,7 @@
                 <w:sz w:val="20"/>
                 <w:szCs w:val="20"/>
               </w:rPr>
-              <w:t xml:space="preserve">One asyncio worker per call. Each utterance passes through a regex pre-screener (microseconds, zero tokens) that produces HINT codes. The Qwen3-4B judge (vLLM, AMD GPU, guided JSON grammar) returns a structured verdict: sentiment score, violation codes, reason. Semaphore(16) caps concurrency; temperature=0 guarantees reproducible verdicts.</w:t>
+              <w:t>One asyncio worker per call enforces FIFO order within each call (required by rule 3, which tracks consecutive customer sentiment). Each utterance first passes a regex pre-screener (microseconds, zero tokens) for HINT codes. Micro-utterances ≤12 chars with no hints are ack'd immediately — no LLM call, saving ~350 tokens and ~300 ms per short turn (~20% of real call volume). Speaker ID is 3-tier: stereo channel metadata (ground truth) → keyword regex for mono ('your agent', 'loyal member', 'how can I help', 'let me pull up') → LLM speaker field for ambiguous chunks only. Qwen3-4B judge returns sentiment, violations, and reason at max_tokens=28 (~18 tokens for a full verdict). Semaphore(16) caps concurrency; temperature=0 guarantees reproducible verdicts.</w:t>
             </w:r>
           </w:p>
           <w:p>
@@ -1694,7 +1694,7 @@
                 <w:sz w:val="20"/>
                 <w:szCs w:val="20"/>
               </w:rPr>
-              <w:t xml:space="preserve">Hallucination loop filter: word-density check (unique words &lt; 15%) drops Whisper/Vosk decoder loops (e.g. “BIRDS CHIRPING” x60, ¶¶ symbols) before they reach the LLM judge or the UI.</w:t>
+              <w:t>ASR quality gate (quality_gated()): multi-check filter — no_speech_prob &gt; 0.5, avg_logprob &lt; −0.8, compression_ratio &gt; 2.8, or unique-word density &lt; 15% — drops hallucination loops and silence before they reach the LLM judge or UI.</w:t>
             </w:r>
           </w:p>
           <w:p>

</xml_diff>